<commit_message>
fix: resolve all TypeScript build errors blocking CI pipeline
- DAG builder: remove unused imports (DagEdge, calculateLlmCost, DagNode,
  fitView), convert DragEvent to type-only imports, convert enum to const
  object for erasableSyntaxOnly, fix Resolver type on NodePropertyPanel
- Trainer pages: add missing useTrainer hook + trainer types module
- Routes: add missing LoadingSpinner + VoiceProviderSettings components
- Include i18n locale files, new hooks, services, and trainer pages from
  prior sessions that were uncommitted

Co-Authored-By: Claude Opus 4.6 (1M context) <noreply@anthropic.com>
</commit_message>
<xml_diff>
--- a/docs/PRISM_and_Job_Blueprint_Process_Guide.docx
+++ b/docs/PRISM_and_Job_Blueprint_Process_Guide.docx
@@ -936,7 +936,6 @@
               <w:rPr>
                 <w:sz w:val="20"/>
               </w:rPr>
-              <w:lastRenderedPageBreak/>
               <w:t>`CreateUser`</w:t>
             </w:r>
           </w:p>
@@ -969,7 +968,14 @@
               <w:rPr>
                 <w:sz w:val="20"/>
               </w:rPr>
-              <w:t>Creates a login on the PRISM platform; subsequent calls use `false`</w:t>
+              <w:t xml:space="preserve">Creates a login on the PRISM platform; subsequent calls use </w:t>
+            </w:r>
+            <w:r>
+              <w:rPr>
+                <w:sz w:val="20"/>
+              </w:rPr>
+              <w:lastRenderedPageBreak/>
+              <w:t>`false`</w:t>
             </w:r>
           </w:p>
         </w:tc>
@@ -988,6 +994,7 @@
               <w:rPr>
                 <w:sz w:val="20"/>
               </w:rPr>
+              <w:lastRenderedPageBreak/>
               <w:t>`IsGift`</w:t>
             </w:r>
           </w:p>
@@ -1551,7 +1558,6 @@
         <w:pStyle w:val="ListNumber"/>
       </w:pPr>
       <w:r>
-        <w:lastRenderedPageBreak/>
         <w:t>The questionnaire has 4 parts that must be completed in order: Part 1A, Part 1B, Part 2A, Part 2B.</w:t>
       </w:r>
     </w:p>
@@ -1579,6 +1585,7 @@
         <w:rPr>
           <w:b/>
         </w:rPr>
+        <w:lastRenderedPageBreak/>
         <w:t>Important:</w:t>
       </w:r>
       <w:r>
@@ -1991,6 +1998,33 @@
           <w:sz w:val="17"/>
         </w:rPr>
         <w:br/>
+        <w:t xml:space="preserve">    "ResponseStatus": 2,</w:t>
+      </w:r>
+      <w:r>
+        <w:rPr>
+          <w:rFonts w:ascii="Consolas" w:hAnsi="Consolas"/>
+          <w:color w:val="1E1E1E"/>
+          <w:sz w:val="17"/>
+        </w:rPr>
+        <w:br/>
+        <w:t xml:space="preserve">    "HistoryList": [</w:t>
+      </w:r>
+      <w:r>
+        <w:rPr>
+          <w:rFonts w:ascii="Consolas" w:hAnsi="Consolas"/>
+          <w:color w:val="1E1E1E"/>
+          <w:sz w:val="17"/>
+        </w:rPr>
+        <w:br/>
+        <w:t xml:space="preserve">      {</w:t>
+      </w:r>
+      <w:r>
+        <w:rPr>
+          <w:rFonts w:ascii="Consolas" w:hAnsi="Consolas"/>
+          <w:color w:val="1E1E1E"/>
+          <w:sz w:val="17"/>
+        </w:rPr>
+        <w:br/>
       </w:r>
       <w:r>
         <w:rPr>
@@ -1999,33 +2033,6 @@
           <w:sz w:val="17"/>
         </w:rPr>
         <w:lastRenderedPageBreak/>
-        <w:t xml:space="preserve">    "ResponseStatus": 2,</w:t>
-      </w:r>
-      <w:r>
-        <w:rPr>
-          <w:rFonts w:ascii="Consolas" w:hAnsi="Consolas"/>
-          <w:color w:val="1E1E1E"/>
-          <w:sz w:val="17"/>
-        </w:rPr>
-        <w:br/>
-        <w:t xml:space="preserve">    "HistoryList": [</w:t>
-      </w:r>
-      <w:r>
-        <w:rPr>
-          <w:rFonts w:ascii="Consolas" w:hAnsi="Consolas"/>
-          <w:color w:val="1E1E1E"/>
-          <w:sz w:val="17"/>
-        </w:rPr>
-        <w:br/>
-        <w:t xml:space="preserve">      {</w:t>
-      </w:r>
-      <w:r>
-        <w:rPr>
-          <w:rFonts w:ascii="Consolas" w:hAnsi="Consolas"/>
-          <w:color w:val="1E1E1E"/>
-          <w:sz w:val="17"/>
-        </w:rPr>
-        <w:br/>
         <w:t xml:space="preserve">        "EntityType": "Professional",</w:t>
       </w:r>
       <w:r>
@@ -2720,14 +2727,6 @@
           <w:sz w:val="17"/>
         </w:rPr>
         <w:br/>
-      </w:r>
-      <w:r>
-        <w:rPr>
-          <w:rFonts w:ascii="Consolas" w:hAnsi="Consolas"/>
-          <w:color w:val="1E1E1E"/>
-          <w:sz w:val="17"/>
-        </w:rPr>
-        <w:lastRenderedPageBreak/>
         <w:t xml:space="preserve">  "RetURL": ""</w:t>
       </w:r>
       <w:r>
@@ -2759,6 +2758,7 @@
           <w:color w:val="1E1E1E"/>
           <w:sz w:val="17"/>
         </w:rPr>
+        <w:lastRenderedPageBreak/>
         <w:t>{</w:t>
       </w:r>
       <w:r>
@@ -3316,52 +3316,59 @@
           <w:color w:val="1E1E1E"/>
           <w:sz w:val="17"/>
         </w:rPr>
+        <w:t>{</w:t>
+      </w:r>
+      <w:r>
+        <w:rPr>
+          <w:rFonts w:ascii="Consolas" w:hAnsi="Consolas"/>
+          <w:color w:val="1E1E1E"/>
+          <w:sz w:val="17"/>
+        </w:rPr>
+        <w:br/>
+        <w:t xml:space="preserve">  "UnlockReportResult": {</w:t>
+      </w:r>
+      <w:r>
+        <w:rPr>
+          <w:rFonts w:ascii="Consolas" w:hAnsi="Consolas"/>
+          <w:color w:val="1E1E1E"/>
+          <w:sz w:val="17"/>
+        </w:rPr>
+        <w:br/>
+        <w:t xml:space="preserve">    "ResponseMessage": "Report unlocked",</w:t>
+      </w:r>
+      <w:r>
+        <w:rPr>
+          <w:rFonts w:ascii="Consolas" w:hAnsi="Consolas"/>
+          <w:color w:val="1E1E1E"/>
+          <w:sz w:val="17"/>
+        </w:rPr>
+        <w:br/>
+        <w:t xml:space="preserve">    "ActionURL1": "https://app.prismbrainmapping.com/report/view/abc123xyz",</w:t>
+      </w:r>
+      <w:r>
+        <w:rPr>
+          <w:rFonts w:ascii="Consolas" w:hAnsi="Consolas"/>
+          <w:color w:val="1E1E1E"/>
+          <w:sz w:val="17"/>
+        </w:rPr>
+        <w:br/>
+        <w:t xml:space="preserve">    "ActionURL2": "",</w:t>
+      </w:r>
+      <w:r>
+        <w:rPr>
+          <w:rFonts w:ascii="Consolas" w:hAnsi="Consolas"/>
+          <w:color w:val="1E1E1E"/>
+          <w:sz w:val="17"/>
+        </w:rPr>
+        <w:br/>
+      </w:r>
+      <w:r>
+        <w:rPr>
+          <w:rFonts w:ascii="Consolas" w:hAnsi="Consolas"/>
+          <w:color w:val="1E1E1E"/>
+          <w:sz w:val="17"/>
+        </w:rPr>
         <w:lastRenderedPageBreak/>
-        <w:t>{</w:t>
-      </w:r>
-      <w:r>
-        <w:rPr>
-          <w:rFonts w:ascii="Consolas" w:hAnsi="Consolas"/>
-          <w:color w:val="1E1E1E"/>
-          <w:sz w:val="17"/>
-        </w:rPr>
-        <w:br/>
-        <w:t xml:space="preserve">  "UnlockReportResult": {</w:t>
-      </w:r>
-      <w:r>
-        <w:rPr>
-          <w:rFonts w:ascii="Consolas" w:hAnsi="Consolas"/>
-          <w:color w:val="1E1E1E"/>
-          <w:sz w:val="17"/>
-        </w:rPr>
-        <w:br/>
-        <w:t xml:space="preserve">    "ResponseMessage": "Report unlocked",</w:t>
-      </w:r>
-      <w:r>
-        <w:rPr>
-          <w:rFonts w:ascii="Consolas" w:hAnsi="Consolas"/>
-          <w:color w:val="1E1E1E"/>
-          <w:sz w:val="17"/>
-        </w:rPr>
-        <w:br/>
-        <w:t xml:space="preserve">    "ActionURL1": "https://app.prismbrainmapping.com/report/view/abc123xyz",</w:t>
-      </w:r>
-      <w:r>
-        <w:rPr>
-          <w:rFonts w:ascii="Consolas" w:hAnsi="Consolas"/>
-          <w:color w:val="1E1E1E"/>
-          <w:sz w:val="17"/>
-        </w:rPr>
-        <w:br/>
-        <w:t xml:space="preserve">    "ActionURL2": "",</w:t>
-      </w:r>
-      <w:r>
-        <w:rPr>
-          <w:rFonts w:ascii="Consolas" w:hAnsi="Consolas"/>
-          <w:color w:val="1E1E1E"/>
-          <w:sz w:val="17"/>
-        </w:rPr>
-        <w:br/>
         <w:t xml:space="preserve">    "IsAuthorised": true,</w:t>
       </w:r>
       <w:r>
@@ -3871,53 +3878,46 @@
           <w:sz w:val="17"/>
         </w:rPr>
         <w:br/>
-      </w:r>
-      <w:r>
-        <w:rPr>
-          <w:rFonts w:ascii="Consolas" w:hAnsi="Consolas"/>
-          <w:color w:val="1E1E1E"/>
-          <w:sz w:val="17"/>
+        <w:t xml:space="preserve">  }</w:t>
+      </w:r>
+      <w:r>
+        <w:rPr>
+          <w:rFonts w:ascii="Consolas" w:hAnsi="Consolas"/>
+          <w:color w:val="1E1E1E"/>
+          <w:sz w:val="17"/>
+        </w:rPr>
+        <w:br/>
+        <w:t>}</w:t>
+      </w:r>
+    </w:p>
+    <w:p>
+      <w:r>
+        <w:t>The four quadrants represent the person's fundamental behavioural preferences:</w:t>
+      </w:r>
+    </w:p>
+    <w:p>
+      <w:pPr>
+        <w:pStyle w:val="ListBullet"/>
+      </w:pPr>
+      <w:r>
+        <w:rPr>
+          <w:b/>
+        </w:rPr>
+        <w:t>Green (QuadID 1):</w:t>
+      </w:r>
+      <w:r>
+        <w:t xml:space="preserve"> People-oriented, empathetic, collaborative</w:t>
+      </w:r>
+    </w:p>
+    <w:p>
+      <w:pPr>
+        <w:pStyle w:val="ListBullet"/>
+      </w:pPr>
+      <w:r>
+        <w:rPr>
+          <w:b/>
         </w:rPr>
         <w:lastRenderedPageBreak/>
-        <w:t xml:space="preserve">  }</w:t>
-      </w:r>
-      <w:r>
-        <w:rPr>
-          <w:rFonts w:ascii="Consolas" w:hAnsi="Consolas"/>
-          <w:color w:val="1E1E1E"/>
-          <w:sz w:val="17"/>
-        </w:rPr>
-        <w:br/>
-        <w:t>}</w:t>
-      </w:r>
-    </w:p>
-    <w:p>
-      <w:r>
-        <w:t>The four quadrants represent the person's fundamental behavioural preferences:</w:t>
-      </w:r>
-    </w:p>
-    <w:p>
-      <w:pPr>
-        <w:pStyle w:val="ListBullet"/>
-      </w:pPr>
-      <w:r>
-        <w:rPr>
-          <w:b/>
-        </w:rPr>
-        <w:t>Green (QuadID 1):</w:t>
-      </w:r>
-      <w:r>
-        <w:t xml:space="preserve"> People-oriented, empathetic, collaborative</w:t>
-      </w:r>
-    </w:p>
-    <w:p>
-      <w:pPr>
-        <w:pStyle w:val="ListBullet"/>
-      </w:pPr>
-      <w:r>
-        <w:rPr>
-          <w:b/>
-        </w:rPr>
         <w:t>Blue (QuadID 2):</w:t>
       </w:r>
       <w:r>
@@ -4356,7 +4356,6 @@
         <w:rPr>
           <w:b/>
         </w:rPr>
-        <w:lastRenderedPageBreak/>
         <w:t>Request:</w:t>
       </w:r>
     </w:p>
@@ -4407,6 +4406,14 @@
           <w:sz w:val="17"/>
         </w:rPr>
         <w:br/>
+      </w:r>
+      <w:r>
+        <w:rPr>
+          <w:rFonts w:ascii="Consolas" w:hAnsi="Consolas"/>
+          <w:color w:val="1E1E1E"/>
+          <w:sz w:val="17"/>
+        </w:rPr>
+        <w:lastRenderedPageBreak/>
         <w:t xml:space="preserve">  "EntityTypeID": 1,</w:t>
       </w:r>
       <w:r>
@@ -4875,7 +4882,6 @@
     </w:p>
     <w:p>
       <w:r>
-        <w:lastRenderedPageBreak/>
         <w:t>Key data fields:</w:t>
       </w:r>
     </w:p>
@@ -4948,6 +4954,7 @@
           <w:color w:val="C0392B"/>
           <w:sz w:val="19"/>
         </w:rPr>
+        <w:lastRenderedPageBreak/>
         <w:t>dtWAData</w:t>
       </w:r>
       <w:r>
@@ -5373,14 +5380,6 @@
           <w:sz w:val="17"/>
         </w:rPr>
         <w:br/>
-      </w:r>
-      <w:r>
-        <w:rPr>
-          <w:rFonts w:ascii="Consolas" w:hAnsi="Consolas"/>
-          <w:color w:val="1E1E1E"/>
-          <w:sz w:val="17"/>
-        </w:rPr>
-        <w:lastRenderedPageBreak/>
         <w:t xml:space="preserve">  }</w:t>
       </w:r>
       <w:r>
@@ -5441,6 +5440,7 @@
         <w:pStyle w:val="Heading2"/>
       </w:pPr>
       <w:r>
+        <w:lastRenderedPageBreak/>
         <w:t>Step 8: Store Report in S3</w:t>
       </w:r>
     </w:p>
@@ -5780,7 +5780,6 @@
         <w:pStyle w:val="Heading3"/>
       </w:pPr>
       <w:r>
-        <w:lastRenderedPageBreak/>
         <w:t>9A. Tokenize</w:t>
       </w:r>
     </w:p>
@@ -5910,6 +5909,7 @@
         <w:pStyle w:val="ListBullet"/>
       </w:pPr>
       <w:r>
+        <w:lastRenderedPageBreak/>
         <w:t>4D quadrant scores (Green, Blue, Red, Gold)</w:t>
       </w:r>
     </w:p>
@@ -6185,7 +6185,6 @@
                 <w:color w:val="FFFFFF"/>
                 <w:sz w:val="20"/>
               </w:rPr>
-              <w:lastRenderedPageBreak/>
               <w:t>Recipient</w:t>
             </w:r>
           </w:p>
@@ -6394,6 +6393,7 @@
               <w:rPr>
                 <w:sz w:val="20"/>
               </w:rPr>
+              <w:lastRenderedPageBreak/>
               <w:t>Company Admin</w:t>
             </w:r>
           </w:p>
@@ -6863,7 +6863,6 @@
         <w:pStyle w:val="Heading2"/>
       </w:pPr>
       <w:r>
-        <w:lastRenderedPageBreak/>
         <w:t>Optional: Upgrade Report Tier</w:t>
       </w:r>
     </w:p>
@@ -6972,6 +6971,7 @@
     </w:p>
     <w:p>
       <w:r>
+        <w:lastRenderedPageBreak/>
         <w:t xml:space="preserve">This upgrades from Foundation (4) to Professional (1). The response contains a new </w:t>
       </w:r>
       <w:r>
@@ -7159,7 +7159,87 @@
           <w:sz w:val="17"/>
         </w:rPr>
         <w:br/>
-        <w:t xml:space="preserve"> |-- Click "Unlock" ------&gt;|                        |                        |                          </w:t>
+        <w:t xml:space="preserve"> |-- Click "Unlock" ------&gt;|                        |                        |                          |</w:t>
+      </w:r>
+      <w:r>
+        <w:rPr>
+          <w:rFonts w:ascii="Consolas" w:hAnsi="Consolas"/>
+          <w:color w:val="1E1E1E"/>
+          <w:sz w:val="17"/>
+        </w:rPr>
+        <w:br/>
+        <w:t xml:space="preserve"> |                          |-- POST /v1/prism/     |                        |                          |</w:t>
+      </w:r>
+      <w:r>
+        <w:rPr>
+          <w:rFonts w:ascii="Consolas" w:hAnsi="Consolas"/>
+          <w:color w:val="1E1E1E"/>
+          <w:sz w:val="17"/>
+        </w:rPr>
+        <w:br/>
+        <w:t xml:space="preserve"> |                          |   unlock ------------&gt;|                        |                          |</w:t>
+      </w:r>
+      <w:r>
+        <w:rPr>
+          <w:rFonts w:ascii="Consolas" w:hAnsi="Consolas"/>
+          <w:color w:val="1E1E1E"/>
+          <w:sz w:val="17"/>
+        </w:rPr>
+        <w:br/>
+        <w:t xml:space="preserve"> |                          |                        |-- POST UnlockReport --&gt;|                          |</w:t>
+      </w:r>
+      <w:r>
+        <w:rPr>
+          <w:rFonts w:ascii="Consolas" w:hAnsi="Consolas"/>
+          <w:color w:val="1E1E1E"/>
+          <w:sz w:val="17"/>
+        </w:rPr>
+        <w:br/>
+        <w:t xml:space="preserve"> |                          |                        |&lt;-- QuestStatus: 6 -----|                          |</w:t>
+      </w:r>
+      <w:r>
+        <w:rPr>
+          <w:rFonts w:ascii="Consolas" w:hAnsi="Consolas"/>
+          <w:color w:val="1E1E1E"/>
+          <w:sz w:val="17"/>
+        </w:rPr>
+        <w:br/>
+        <w:t xml:space="preserve"> |                          |                        |   (report URL)         |                          |</w:t>
+      </w:r>
+      <w:r>
+        <w:rPr>
+          <w:rFonts w:ascii="Consolas" w:hAnsi="Consolas"/>
+          <w:color w:val="1E1E1E"/>
+          <w:sz w:val="17"/>
+        </w:rPr>
+        <w:br/>
+        <w:t xml:space="preserve"> |                          |                        |                        |                          |</w:t>
+      </w:r>
+      <w:r>
+        <w:rPr>
+          <w:rFonts w:ascii="Consolas" w:hAnsi="Consolas"/>
+          <w:color w:val="1E1E1E"/>
+          <w:sz w:val="17"/>
+        </w:rPr>
+        <w:br/>
+        <w:t xml:space="preserve"> |                          |                        |-- POST Fetch4DRaw ----&gt;|                          |</w:t>
+      </w:r>
+      <w:r>
+        <w:rPr>
+          <w:rFonts w:ascii="Consolas" w:hAnsi="Consolas"/>
+          <w:color w:val="1E1E1E"/>
+          <w:sz w:val="17"/>
+        </w:rPr>
+        <w:br/>
+        <w:t xml:space="preserve"> |                          |                        |-- POST FetchFullMap --&gt;|                          |</w:t>
+      </w:r>
+      <w:r>
+        <w:rPr>
+          <w:rFonts w:ascii="Consolas" w:hAnsi="Consolas"/>
+          <w:color w:val="1E1E1E"/>
+          <w:sz w:val="17"/>
+        </w:rPr>
+        <w:br/>
       </w:r>
       <w:r>
         <w:rPr>
@@ -7168,87 +7248,6 @@
           <w:sz w:val="17"/>
         </w:rPr>
         <w:lastRenderedPageBreak/>
-        <w:t>|</w:t>
-      </w:r>
-      <w:r>
-        <w:rPr>
-          <w:rFonts w:ascii="Consolas" w:hAnsi="Consolas"/>
-          <w:color w:val="1E1E1E"/>
-          <w:sz w:val="17"/>
-        </w:rPr>
-        <w:br/>
-        <w:t xml:space="preserve"> |                          |-- POST /v1/prism/     |                        |                          |</w:t>
-      </w:r>
-      <w:r>
-        <w:rPr>
-          <w:rFonts w:ascii="Consolas" w:hAnsi="Consolas"/>
-          <w:color w:val="1E1E1E"/>
-          <w:sz w:val="17"/>
-        </w:rPr>
-        <w:br/>
-        <w:t xml:space="preserve"> |                          |   unlock ------------&gt;|                        |                          |</w:t>
-      </w:r>
-      <w:r>
-        <w:rPr>
-          <w:rFonts w:ascii="Consolas" w:hAnsi="Consolas"/>
-          <w:color w:val="1E1E1E"/>
-          <w:sz w:val="17"/>
-        </w:rPr>
-        <w:br/>
-        <w:t xml:space="preserve"> |                          |                        |-- POST UnlockReport --&gt;|                          |</w:t>
-      </w:r>
-      <w:r>
-        <w:rPr>
-          <w:rFonts w:ascii="Consolas" w:hAnsi="Consolas"/>
-          <w:color w:val="1E1E1E"/>
-          <w:sz w:val="17"/>
-        </w:rPr>
-        <w:br/>
-        <w:t xml:space="preserve"> |                          |                        |&lt;-- QuestStatus: 6 -----|                          |</w:t>
-      </w:r>
-      <w:r>
-        <w:rPr>
-          <w:rFonts w:ascii="Consolas" w:hAnsi="Consolas"/>
-          <w:color w:val="1E1E1E"/>
-          <w:sz w:val="17"/>
-        </w:rPr>
-        <w:br/>
-        <w:t xml:space="preserve"> |                          |                        |   (report URL)         |                          |</w:t>
-      </w:r>
-      <w:r>
-        <w:rPr>
-          <w:rFonts w:ascii="Consolas" w:hAnsi="Consolas"/>
-          <w:color w:val="1E1E1E"/>
-          <w:sz w:val="17"/>
-        </w:rPr>
-        <w:br/>
-        <w:t xml:space="preserve"> |                          |                        |                        |                          |</w:t>
-      </w:r>
-      <w:r>
-        <w:rPr>
-          <w:rFonts w:ascii="Consolas" w:hAnsi="Consolas"/>
-          <w:color w:val="1E1E1E"/>
-          <w:sz w:val="17"/>
-        </w:rPr>
-        <w:br/>
-        <w:t xml:space="preserve"> |                          |                        |-- POST Fetch4DRaw ----&gt;|                          |</w:t>
-      </w:r>
-      <w:r>
-        <w:rPr>
-          <w:rFonts w:ascii="Consolas" w:hAnsi="Consolas"/>
-          <w:color w:val="1E1E1E"/>
-          <w:sz w:val="17"/>
-        </w:rPr>
-        <w:br/>
-        <w:t xml:space="preserve"> |                          |                        |-- POST FetchFullMap --&gt;|                          |</w:t>
-      </w:r>
-      <w:r>
-        <w:rPr>
-          <w:rFonts w:ascii="Consolas" w:hAnsi="Consolas"/>
-          <w:color w:val="1E1E1E"/>
-          <w:sz w:val="17"/>
-        </w:rPr>
-        <w:br/>
         <w:t xml:space="preserve"> |                          |                        |-- POST FetchReportData&gt;|                          |</w:t>
       </w:r>
       <w:r>
@@ -7462,6 +7461,7 @@
         <w:pStyle w:val="Heading2"/>
       </w:pPr>
       <w:r>
+        <w:lastRenderedPageBreak/>
         <w:t>Step 1: Create a Job DNA Profile (6-Step Wizard)</w:t>
       </w:r>
     </w:p>
@@ -7926,7 +7926,6 @@
               <w:rPr>
                 <w:sz w:val="20"/>
               </w:rPr>
-              <w:lastRenderedPageBreak/>
               <w:t>Initiating</w:t>
             </w:r>
           </w:p>
@@ -8616,6 +8615,7 @@
     </w:tbl>
     <w:p>
       <w:r>
+        <w:lastRenderedPageBreak/>
         <w:t xml:space="preserve">The top 3 behaviours become the </w:t>
       </w:r>
       <w:r>
@@ -9048,134 +9048,134 @@
     </w:p>
     <w:p>
       <w:r>
+        <w:t>The 6 traits: Relationship Management, Emotional Stability, Decisiveness, Self-Motivation, Conscientiousness, Flexibility.</w:t>
+      </w:r>
+    </w:p>
+    <w:p>
+      <w:pPr>
+        <w:pStyle w:val="Heading3"/>
+      </w:pPr>
+      <w:r>
+        <w:t>Step 1.5: Role Context &amp; Environment</w:t>
+      </w:r>
+    </w:p>
+    <w:p>
+      <w:r>
+        <w:t>The practitioner describes the work environment:</w:t>
+      </w:r>
+    </w:p>
+    <w:p>
+      <w:pPr>
+        <w:pStyle w:val="ListBullet"/>
+      </w:pPr>
+      <w:r>
+        <w:rPr>
+          <w:b/>
+        </w:rPr>
+        <w:t>Work pressures</w:t>
+      </w:r>
+      <w:r>
+        <w:t xml:space="preserve"> — deadlines, pace, volume</w:t>
+      </w:r>
+    </w:p>
+    <w:p>
+      <w:pPr>
+        <w:pStyle w:val="ListBullet"/>
+      </w:pPr>
+      <w:r>
+        <w:rPr>
+          <w:b/>
+        </w:rPr>
+        <w:t>Required work styles</w:t>
+      </w:r>
+      <w:r>
+        <w:t xml:space="preserve"> — independent, collaborative, structured, flexible</w:t>
+      </w:r>
+    </w:p>
+    <w:p>
+      <w:pPr>
+        <w:pStyle w:val="ListBullet"/>
+      </w:pPr>
+      <w:r>
+        <w:rPr>
+          <w:b/>
+        </w:rPr>
+        <w:t>Environmental factors</w:t>
+      </w:r>
+      <w:r>
+        <w:t xml:space="preserve"> — office, remote, hybrid, travel</w:t>
+      </w:r>
+    </w:p>
+    <w:p>
+      <w:pPr>
+        <w:pStyle w:val="ListBullet"/>
+      </w:pPr>
+      <w:r>
+        <w:rPr>
+          <w:b/>
+        </w:rPr>
+        <w:t>Cultural factors</w:t>
+      </w:r>
+      <w:r>
+        <w:t xml:space="preserve"> — formal, casual, innovative, traditional</w:t>
+      </w:r>
+    </w:p>
+    <w:p>
+      <w:pPr>
+        <w:pStyle w:val="Heading3"/>
+      </w:pPr>
+      <w:r>
+        <w:t>Step 1.6: Review &amp; Submit</w:t>
+      </w:r>
+    </w:p>
+    <w:p>
+      <w:pPr>
+        <w:pStyle w:val="ListBullet"/>
+      </w:pPr>
+      <w:r>
+        <w:t xml:space="preserve">The system displays a </w:t>
+      </w:r>
+      <w:r>
+        <w:rPr>
+          <w:b/>
+        </w:rPr>
+        <w:t>radar chart</w:t>
+      </w:r>
+      <w:r>
+        <w:t xml:space="preserve"> showing all 22 dimension benchmarks.</w:t>
+      </w:r>
+    </w:p>
+    <w:p>
+      <w:pPr>
+        <w:pStyle w:val="ListBullet"/>
+      </w:pPr>
+      <w:r>
+        <w:t>The practitioner reviews the complete Job DNA profile.</w:t>
+      </w:r>
+    </w:p>
+    <w:p>
+      <w:pPr>
+        <w:pStyle w:val="ListBullet"/>
+      </w:pPr>
+      <w:r>
+        <w:t xml:space="preserve">Clicks </w:t>
+      </w:r>
+      <w:r>
+        <w:rPr>
+          <w:b/>
+        </w:rPr>
+        <w:t>Submit</w:t>
+      </w:r>
+      <w:r>
+        <w:t xml:space="preserve"> to finalize the benchmark.</w:t>
+      </w:r>
+    </w:p>
+    <w:p>
+      <w:pPr>
+        <w:pStyle w:val="ListBullet"/>
+      </w:pPr>
+      <w:r>
         <w:lastRenderedPageBreak/>
-        <w:t>The 6 traits: Relationship Management, Emotional Stability, Decisiveness, Self-Motivation, Conscientiousness, Flexibility.</w:t>
-      </w:r>
-    </w:p>
-    <w:p>
-      <w:pPr>
-        <w:pStyle w:val="Heading3"/>
-      </w:pPr>
-      <w:r>
-        <w:t>Step 1.5: Role Context &amp; Environment</w:t>
-      </w:r>
-    </w:p>
-    <w:p>
-      <w:r>
-        <w:t>The practitioner describes the work environment:</w:t>
-      </w:r>
-    </w:p>
-    <w:p>
-      <w:pPr>
-        <w:pStyle w:val="ListBullet"/>
-      </w:pPr>
-      <w:r>
-        <w:rPr>
-          <w:b/>
-        </w:rPr>
-        <w:t>Work pressures</w:t>
-      </w:r>
-      <w:r>
-        <w:t xml:space="preserve"> — deadlines, pace, volume</w:t>
-      </w:r>
-    </w:p>
-    <w:p>
-      <w:pPr>
-        <w:pStyle w:val="ListBullet"/>
-      </w:pPr>
-      <w:r>
-        <w:rPr>
-          <w:b/>
-        </w:rPr>
-        <w:t>Required work styles</w:t>
-      </w:r>
-      <w:r>
-        <w:t xml:space="preserve"> — independent, collaborative, structured, flexible</w:t>
-      </w:r>
-    </w:p>
-    <w:p>
-      <w:pPr>
-        <w:pStyle w:val="ListBullet"/>
-      </w:pPr>
-      <w:r>
-        <w:rPr>
-          <w:b/>
-        </w:rPr>
-        <w:t>Environmental factors</w:t>
-      </w:r>
-      <w:r>
-        <w:t xml:space="preserve"> — office, remote, hybrid, travel</w:t>
-      </w:r>
-    </w:p>
-    <w:p>
-      <w:pPr>
-        <w:pStyle w:val="ListBullet"/>
-      </w:pPr>
-      <w:r>
-        <w:rPr>
-          <w:b/>
-        </w:rPr>
-        <w:t>Cultural factors</w:t>
-      </w:r>
-      <w:r>
-        <w:t xml:space="preserve"> — formal, casual, innovative, traditional</w:t>
-      </w:r>
-    </w:p>
-    <w:p>
-      <w:pPr>
-        <w:pStyle w:val="Heading3"/>
-      </w:pPr>
-      <w:r>
-        <w:t>Step 1.6: Review &amp; Submit</w:t>
-      </w:r>
-    </w:p>
-    <w:p>
-      <w:pPr>
-        <w:pStyle w:val="ListBullet"/>
-      </w:pPr>
-      <w:r>
-        <w:t xml:space="preserve">The system displays a </w:t>
-      </w:r>
-      <w:r>
-        <w:rPr>
-          <w:b/>
-        </w:rPr>
-        <w:t>radar chart</w:t>
-      </w:r>
-      <w:r>
-        <w:t xml:space="preserve"> showing all 22 dimension benchmarks.</w:t>
-      </w:r>
-    </w:p>
-    <w:p>
-      <w:pPr>
-        <w:pStyle w:val="ListBullet"/>
-      </w:pPr>
-      <w:r>
-        <w:t>The practitioner reviews the complete Job DNA profile.</w:t>
-      </w:r>
-    </w:p>
-    <w:p>
-      <w:pPr>
-        <w:pStyle w:val="ListBullet"/>
-      </w:pPr>
-      <w:r>
-        <w:t xml:space="preserve">Clicks </w:t>
-      </w:r>
-      <w:r>
-        <w:rPr>
-          <w:b/>
-        </w:rPr>
-        <w:t>Submit</w:t>
-      </w:r>
-      <w:r>
-        <w:t xml:space="preserve"> to finalize the benchmark.</w:t>
-      </w:r>
-    </w:p>
-    <w:p>
-      <w:pPr>
-        <w:pStyle w:val="ListBullet"/>
-      </w:pPr>
-      <w:r>
         <w:t xml:space="preserve">The Job DNA is saved with status </w:t>
       </w:r>
       <w:r>
@@ -9569,7 +9569,6 @@
         <w:pStyle w:val="Heading2"/>
       </w:pPr>
       <w:r>
-        <w:lastRenderedPageBreak/>
         <w:t>Step 3: Best-Fit Scoring &amp; Candidate Ranking</w:t>
       </w:r>
     </w:p>
@@ -9673,6 +9672,7 @@
         <w:pStyle w:val="Heading3"/>
       </w:pPr>
       <w:r>
+        <w:lastRenderedPageBreak/>
         <w:t>3C. Calculate Statistical Metrics</w:t>
       </w:r>
     </w:p>
@@ -10295,14 +10295,7 @@
               <w:rPr>
                 <w:sz w:val="20"/>
               </w:rPr>
-              <w:t xml:space="preserve">Candidate </w:t>
-            </w:r>
-            <w:r>
-              <w:rPr>
-                <w:sz w:val="20"/>
-              </w:rPr>
-              <w:lastRenderedPageBreak/>
-              <w:t>A</w:t>
+              <w:t>Candidate A</w:t>
             </w:r>
           </w:p>
         </w:tc>
@@ -10318,7 +10311,6 @@
               <w:rPr>
                 <w:sz w:val="20"/>
               </w:rPr>
-              <w:lastRenderedPageBreak/>
               <w:t>28</w:t>
             </w:r>
           </w:p>
@@ -10846,6 +10838,7 @@
     </w:p>
     <w:p>
       <w:r>
+        <w:lastRenderedPageBreak/>
         <w:t>For each candidate advancing to interview, James generates a personalised interview guide containing:</w:t>
       </w:r>
     </w:p>
@@ -11094,7 +11087,6 @@
                 <w:color w:val="FFFFFF"/>
                 <w:sz w:val="20"/>
               </w:rPr>
-              <w:lastRenderedPageBreak/>
               <w:t>Section</w:t>
             </w:r>
           </w:p>
@@ -11541,6 +11533,7 @@
         <w:rPr>
           <w:b/>
         </w:rPr>
+        <w:lastRenderedPageBreak/>
         <w:t>For counter-productive behaviours (inverted):</w:t>
       </w:r>
     </w:p>
@@ -11853,182 +11846,182 @@
     </w:p>
     <w:p>
       <w:r>
+        <w:t xml:space="preserve">After the interview scorecard is completed, the system generates a comprehensive </w:t>
+      </w:r>
+      <w:r>
+        <w:rPr>
+          <w:b/>
+        </w:rPr>
+        <w:t>Insight Package</w:t>
+      </w:r>
+      <w:r>
+        <w:t xml:space="preserve"> for the hiring manager:</w:t>
+      </w:r>
+    </w:p>
+    <w:p>
+      <w:pPr>
+        <w:pStyle w:val="ListNumber"/>
+      </w:pPr>
+      <w:r>
+        <w:rPr>
+          <w:b/>
+        </w:rPr>
+        <w:t>Fit Score Summary</w:t>
+      </w:r>
+      <w:r>
+        <w:t xml:space="preserve"> — total variation, classification tier, confidence</w:t>
+      </w:r>
+    </w:p>
+    <w:p>
+      <w:pPr>
+        <w:pStyle w:val="ListNumber"/>
+      </w:pPr>
+      <w:r>
+        <w:rPr>
+          <w:b/>
+        </w:rPr>
+        <w:t>Gap Analysis Table</w:t>
+      </w:r>
+      <w:r>
+        <w:t xml:space="preserve"> — per-dimension comparison of candidate score vs benchmark, with gap size and specific recommendations</w:t>
+      </w:r>
+    </w:p>
+    <w:p>
+      <w:pPr>
+        <w:pStyle w:val="ListNumber"/>
+      </w:pPr>
+      <w:r>
+        <w:rPr>
+          <w:b/>
+        </w:rPr>
+        <w:t>Interview Focus Areas</w:t>
+      </w:r>
+      <w:r>
+        <w:t xml:space="preserve"> — summary of key findings from the scorecard</w:t>
+      </w:r>
+    </w:p>
+    <w:p>
+      <w:pPr>
+        <w:pStyle w:val="ListNumber"/>
+      </w:pPr>
+      <w:r>
+        <w:rPr>
+          <w:b/>
+        </w:rPr>
+        <w:t>Probe Questions</w:t>
+      </w:r>
+      <w:r>
+        <w:t xml:space="preserve"> — additional questions if a follow-up interview is needed</w:t>
+      </w:r>
+    </w:p>
+    <w:p>
+      <w:pPr>
+        <w:pStyle w:val="ListNumber"/>
+      </w:pPr>
+      <w:r>
+        <w:rPr>
+          <w:b/>
+        </w:rPr>
+        <w:t>Risk Factors</w:t>
+      </w:r>
+      <w:r>
+        <w:t xml:space="preserve"> — areas where the candidate may underperform</w:t>
+      </w:r>
+    </w:p>
+    <w:p>
+      <w:pPr>
+        <w:pStyle w:val="ListNumber"/>
+      </w:pPr>
+      <w:r>
+        <w:rPr>
+          <w:b/>
+        </w:rPr>
+        <w:t>Opportunity Factors</w:t>
+      </w:r>
+      <w:r>
+        <w:t xml:space="preserve"> — areas where the candidate could exceed expectations</w:t>
+      </w:r>
+    </w:p>
+    <w:p>
+      <w:pPr>
+        <w:pStyle w:val="ListNumber"/>
+      </w:pPr>
+      <w:r>
+        <w:rPr>
+          <w:b/>
+        </w:rPr>
+        <w:t>Candidate Comparison Matrix</w:t>
+      </w:r>
+      <w:r>
+        <w:t xml:space="preserve"> — if multiple candidates, side-by-side analysis</w:t>
+      </w:r>
+    </w:p>
+    <w:p/>
+    <w:p>
+      <w:pPr>
+        <w:pStyle w:val="Heading2"/>
+      </w:pPr>
+      <w:r>
+        <w:t>Step 7: Hire Decision &amp; Onboarding</w:t>
+      </w:r>
+    </w:p>
+    <w:p>
+      <w:r>
+        <w:rPr>
+          <w:b/>
+        </w:rPr>
+        <w:t>Who:</w:t>
+      </w:r>
+      <w:r>
+        <w:t xml:space="preserve"> Hiring manager.</w:t>
+      </w:r>
+    </w:p>
+    <w:p>
+      <w:r>
+        <w:rPr>
+          <w:b/>
+        </w:rPr>
+        <w:t>What happens:</w:t>
+      </w:r>
+    </w:p>
+    <w:p>
+      <w:pPr>
+        <w:pStyle w:val="ListNumber"/>
+      </w:pPr>
+      <w:r>
+        <w:t>The hiring manager reviews the Insight Package and candidate rankings.</w:t>
+      </w:r>
+    </w:p>
+    <w:p>
+      <w:pPr>
+        <w:pStyle w:val="ListNumber"/>
+      </w:pPr>
+      <w:r>
+        <w:t>Makes a hire/no-hire decision based on:</w:t>
+      </w:r>
+    </w:p>
+    <w:p>
+      <w:pPr>
+        <w:pStyle w:val="ListBullet2"/>
+      </w:pPr>
+      <w:r>
+        <w:t>Best-Fit ranking position</w:t>
+      </w:r>
+    </w:p>
+    <w:p>
+      <w:pPr>
+        <w:pStyle w:val="ListBullet2"/>
+      </w:pPr>
+      <w:r>
+        <w:t>Interview scorecard grand total and recommendation</w:t>
+      </w:r>
+    </w:p>
+    <w:p>
+      <w:pPr>
+        <w:pStyle w:val="ListBullet2"/>
+      </w:pPr>
+      <w:r>
         <w:lastRenderedPageBreak/>
-        <w:t xml:space="preserve">After the interview scorecard is completed, the system generates a comprehensive </w:t>
-      </w:r>
-      <w:r>
-        <w:rPr>
-          <w:b/>
-        </w:rPr>
-        <w:t>Insight Package</w:t>
-      </w:r>
-      <w:r>
-        <w:t xml:space="preserve"> for the hiring manager:</w:t>
-      </w:r>
-    </w:p>
-    <w:p>
-      <w:pPr>
-        <w:pStyle w:val="ListNumber"/>
-      </w:pPr>
-      <w:r>
-        <w:rPr>
-          <w:b/>
-        </w:rPr>
-        <w:t>Fit Score Summary</w:t>
-      </w:r>
-      <w:r>
-        <w:t xml:space="preserve"> — total variation, classification tier, confidence</w:t>
-      </w:r>
-    </w:p>
-    <w:p>
-      <w:pPr>
-        <w:pStyle w:val="ListNumber"/>
-      </w:pPr>
-      <w:r>
-        <w:rPr>
-          <w:b/>
-        </w:rPr>
-        <w:t>Gap Analysis Table</w:t>
-      </w:r>
-      <w:r>
-        <w:t xml:space="preserve"> — per-dimension comparison of candidate score vs benchmark, with gap size and specific recommendations</w:t>
-      </w:r>
-    </w:p>
-    <w:p>
-      <w:pPr>
-        <w:pStyle w:val="ListNumber"/>
-      </w:pPr>
-      <w:r>
-        <w:rPr>
-          <w:b/>
-        </w:rPr>
-        <w:t>Interview Focus Areas</w:t>
-      </w:r>
-      <w:r>
-        <w:t xml:space="preserve"> — summary of key findings from the scorecard</w:t>
-      </w:r>
-    </w:p>
-    <w:p>
-      <w:pPr>
-        <w:pStyle w:val="ListNumber"/>
-      </w:pPr>
-      <w:r>
-        <w:rPr>
-          <w:b/>
-        </w:rPr>
-        <w:t>Probe Questions</w:t>
-      </w:r>
-      <w:r>
-        <w:t xml:space="preserve"> — additional questions if a follow-up interview is needed</w:t>
-      </w:r>
-    </w:p>
-    <w:p>
-      <w:pPr>
-        <w:pStyle w:val="ListNumber"/>
-      </w:pPr>
-      <w:r>
-        <w:rPr>
-          <w:b/>
-        </w:rPr>
-        <w:t>Risk Factors</w:t>
-      </w:r>
-      <w:r>
-        <w:t xml:space="preserve"> — areas where the candidate may underperform</w:t>
-      </w:r>
-    </w:p>
-    <w:p>
-      <w:pPr>
-        <w:pStyle w:val="ListNumber"/>
-      </w:pPr>
-      <w:r>
-        <w:rPr>
-          <w:b/>
-        </w:rPr>
-        <w:t>Opportunity Factors</w:t>
-      </w:r>
-      <w:r>
-        <w:t xml:space="preserve"> — areas where the candidate could exceed expectations</w:t>
-      </w:r>
-    </w:p>
-    <w:p>
-      <w:pPr>
-        <w:pStyle w:val="ListNumber"/>
-      </w:pPr>
-      <w:r>
-        <w:rPr>
-          <w:b/>
-        </w:rPr>
-        <w:t>Candidate Comparison Matrix</w:t>
-      </w:r>
-      <w:r>
-        <w:t xml:space="preserve"> — if multiple candidates, side-by-side analysis</w:t>
-      </w:r>
-    </w:p>
-    <w:p/>
-    <w:p>
-      <w:pPr>
-        <w:pStyle w:val="Heading2"/>
-      </w:pPr>
-      <w:r>
-        <w:t>Step 7: Hire Decision &amp; Onboarding</w:t>
-      </w:r>
-    </w:p>
-    <w:p>
-      <w:r>
-        <w:rPr>
-          <w:b/>
-        </w:rPr>
-        <w:t>Who:</w:t>
-      </w:r>
-      <w:r>
-        <w:t xml:space="preserve"> Hiring manager.</w:t>
-      </w:r>
-    </w:p>
-    <w:p>
-      <w:r>
-        <w:rPr>
-          <w:b/>
-        </w:rPr>
-        <w:t>What happens:</w:t>
-      </w:r>
-    </w:p>
-    <w:p>
-      <w:pPr>
-        <w:pStyle w:val="ListNumber"/>
-      </w:pPr>
-      <w:r>
-        <w:t>The hiring manager reviews the Insight Package and candidate rankings.</w:t>
-      </w:r>
-    </w:p>
-    <w:p>
-      <w:pPr>
-        <w:pStyle w:val="ListNumber"/>
-      </w:pPr>
-      <w:r>
-        <w:t>Makes a hire/no-hire decision based on:</w:t>
-      </w:r>
-    </w:p>
-    <w:p>
-      <w:pPr>
-        <w:pStyle w:val="ListBullet2"/>
-      </w:pPr>
-      <w:r>
-        <w:t>Best-Fit ranking position</w:t>
-      </w:r>
-    </w:p>
-    <w:p>
-      <w:pPr>
-        <w:pStyle w:val="ListBullet2"/>
-      </w:pPr>
-      <w:r>
-        <w:t>Interview scorecard grand total and recommendation</w:t>
-      </w:r>
-    </w:p>
-    <w:p>
-      <w:pPr>
-        <w:pStyle w:val="ListBullet2"/>
-      </w:pPr>
-      <w:r>
         <w:t>Insight Package risk/opportunity analysis</w:t>
       </w:r>
     </w:p>
@@ -12265,6 +12258,276 @@
           <w:sz w:val="17"/>
         </w:rPr>
         <w:br/>
+        <w:t xml:space="preserve">     |-- Add candidates -------&gt;|                          |                          |</w:t>
+      </w:r>
+      <w:r>
+        <w:rPr>
+          <w:rFonts w:ascii="Consolas" w:hAnsi="Consolas"/>
+          <w:color w:val="1E1E1E"/>
+          <w:sz w:val="17"/>
+        </w:rPr>
+        <w:br/>
+        <w:t xml:space="preserve">     |                          |-- Send BML invitation --&gt;|                          |</w:t>
+      </w:r>
+      <w:r>
+        <w:rPr>
+          <w:rFonts w:ascii="Consolas" w:hAnsi="Consolas"/>
+          <w:color w:val="1E1E1E"/>
+          <w:sz w:val="17"/>
+        </w:rPr>
+        <w:br/>
+        <w:t xml:space="preserve">     |                          |                          |                          |</w:t>
+      </w:r>
+      <w:r>
+        <w:rPr>
+          <w:rFonts w:ascii="Consolas" w:hAnsi="Consolas"/>
+          <w:color w:val="1E1E1E"/>
+          <w:sz w:val="17"/>
+        </w:rPr>
+        <w:br/>
+        <w:t xml:space="preserve">     |                          |                          |-- Complete 48-question    |</w:t>
+      </w:r>
+      <w:r>
+        <w:rPr>
+          <w:rFonts w:ascii="Consolas" w:hAnsi="Consolas"/>
+          <w:color w:val="1E1E1E"/>
+          <w:sz w:val="17"/>
+        </w:rPr>
+        <w:br/>
+        <w:t xml:space="preserve">     |                          |                          |   Likert survey (15 min)  |</w:t>
+      </w:r>
+      <w:r>
+        <w:rPr>
+          <w:rFonts w:ascii="Consolas" w:hAnsi="Consolas"/>
+          <w:color w:val="1E1E1E"/>
+          <w:sz w:val="17"/>
+        </w:rPr>
+        <w:br/>
+        <w:t xml:space="preserve">     |                          |                          |                          |</w:t>
+      </w:r>
+      <w:r>
+        <w:rPr>
+          <w:rFonts w:ascii="Consolas" w:hAnsi="Consolas"/>
+          <w:color w:val="1E1E1E"/>
+          <w:sz w:val="17"/>
+        </w:rPr>
+        <w:br/>
+        <w:t xml:space="preserve">     |                          |&lt;-- BML responses --------|                          |</w:t>
+      </w:r>
+      <w:r>
+        <w:rPr>
+          <w:rFonts w:ascii="Consolas" w:hAnsi="Consolas"/>
+          <w:color w:val="1E1E1E"/>
+          <w:sz w:val="17"/>
+        </w:rPr>
+        <w:br/>
+        <w:t xml:space="preserve">     |                          |                          |                          |</w:t>
+      </w:r>
+      <w:r>
+        <w:rPr>
+          <w:rFonts w:ascii="Consolas" w:hAnsi="Consolas"/>
+          <w:color w:val="1E1E1E"/>
+          <w:sz w:val="17"/>
+        </w:rPr>
+        <w:br/>
+        <w:t xml:space="preserve">     |                          |-- Normalize scores       |                          |</w:t>
+      </w:r>
+      <w:r>
+        <w:rPr>
+          <w:rFonts w:ascii="Consolas" w:hAnsi="Consolas"/>
+          <w:color w:val="1E1E1E"/>
+          <w:sz w:val="17"/>
+        </w:rPr>
+        <w:br/>
+        <w:t xml:space="preserve">     |                          |   (Likert 1-7 → 0-100%) |                          |</w:t>
+      </w:r>
+      <w:r>
+        <w:rPr>
+          <w:rFonts w:ascii="Consolas" w:hAnsi="Consolas"/>
+          <w:color w:val="1E1E1E"/>
+          <w:sz w:val="17"/>
+        </w:rPr>
+        <w:br/>
+        <w:t xml:space="preserve">     |                          |                          |                          |</w:t>
+      </w:r>
+      <w:r>
+        <w:rPr>
+          <w:rFonts w:ascii="Consolas" w:hAnsi="Consolas"/>
+          <w:color w:val="1E1E1E"/>
+          <w:sz w:val="17"/>
+        </w:rPr>
+        <w:br/>
+        <w:t xml:space="preserve">     |                          |-- Calculate variation    |                          |</w:t>
+      </w:r>
+      <w:r>
+        <w:rPr>
+          <w:rFonts w:ascii="Consolas" w:hAnsi="Consolas"/>
+          <w:color w:val="1E1E1E"/>
+          <w:sz w:val="17"/>
+        </w:rPr>
+        <w:br/>
+        <w:t xml:space="preserve">     |                          |   per dimension          |                          |</w:t>
+      </w:r>
+      <w:r>
+        <w:rPr>
+          <w:rFonts w:ascii="Consolas" w:hAnsi="Consolas"/>
+          <w:color w:val="1E1E1E"/>
+          <w:sz w:val="17"/>
+        </w:rPr>
+        <w:br/>
+        <w:t xml:space="preserve">     |                          |                          |                          |</w:t>
+      </w:r>
+      <w:r>
+        <w:rPr>
+          <w:rFonts w:ascii="Consolas" w:hAnsi="Consolas"/>
+          <w:color w:val="1E1E1E"/>
+          <w:sz w:val="17"/>
+        </w:rPr>
+        <w:br/>
+        <w:t xml:space="preserve">     |                          |-- Classify tier          |                          |</w:t>
+      </w:r>
+      <w:r>
+        <w:rPr>
+          <w:rFonts w:ascii="Consolas" w:hAnsi="Consolas"/>
+          <w:color w:val="1E1E1E"/>
+          <w:sz w:val="17"/>
+        </w:rPr>
+        <w:br/>
+        <w:t xml:space="preserve">     |                          |   (Strong/Potential/     |                          |</w:t>
+      </w:r>
+      <w:r>
+        <w:rPr>
+          <w:rFonts w:ascii="Consolas" w:hAnsi="Consolas"/>
+          <w:color w:val="1E1E1E"/>
+          <w:sz w:val="17"/>
+        </w:rPr>
+        <w:br/>
+        <w:t xml:space="preserve">     |                          |    Misalignment)         |                          |</w:t>
+      </w:r>
+      <w:r>
+        <w:rPr>
+          <w:rFonts w:ascii="Consolas" w:hAnsi="Consolas"/>
+          <w:color w:val="1E1E1E"/>
+          <w:sz w:val="17"/>
+        </w:rPr>
+        <w:br/>
+        <w:t xml:space="preserve">     |                          |                          |                          |</w:t>
+      </w:r>
+      <w:r>
+        <w:rPr>
+          <w:rFonts w:ascii="Consolas" w:hAnsi="Consolas"/>
+          <w:color w:val="1E1E1E"/>
+          <w:sz w:val="17"/>
+        </w:rPr>
+        <w:br/>
+        <w:t xml:space="preserve">     |                          |-- Rank all candidates    |                          |</w:t>
+      </w:r>
+      <w:r>
+        <w:rPr>
+          <w:rFonts w:ascii="Consolas" w:hAnsi="Consolas"/>
+          <w:color w:val="1E1E1E"/>
+          <w:sz w:val="17"/>
+        </w:rPr>
+        <w:br/>
+        <w:t xml:space="preserve">     |                          |   by total variation     |                          |</w:t>
+      </w:r>
+      <w:r>
+        <w:rPr>
+          <w:rFonts w:ascii="Consolas" w:hAnsi="Consolas"/>
+          <w:color w:val="1E1E1E"/>
+          <w:sz w:val="17"/>
+        </w:rPr>
+        <w:br/>
+        <w:t xml:space="preserve">     |                          |                          |                          |</w:t>
+      </w:r>
+      <w:r>
+        <w:rPr>
+          <w:rFonts w:ascii="Consolas" w:hAnsi="Consolas"/>
+          <w:color w:val="1E1E1E"/>
+          <w:sz w:val="17"/>
+        </w:rPr>
+        <w:br/>
+        <w:t xml:space="preserve">     |&lt;-- Ranked shortlist -----|                          |                          |</w:t>
+      </w:r>
+      <w:r>
+        <w:rPr>
+          <w:rFonts w:ascii="Consolas" w:hAnsi="Consolas"/>
+          <w:color w:val="1E1E1E"/>
+          <w:sz w:val="17"/>
+        </w:rPr>
+        <w:br/>
+        <w:t xml:space="preserve">     |                          |                          |                          |</w:t>
+      </w:r>
+      <w:r>
+        <w:rPr>
+          <w:rFonts w:ascii="Consolas" w:hAnsi="Consolas"/>
+          <w:color w:val="1E1E1E"/>
+          <w:sz w:val="17"/>
+        </w:rPr>
+        <w:br/>
+        <w:t xml:space="preserve">     |                          |-- James generates        |                          |</w:t>
+      </w:r>
+      <w:r>
+        <w:rPr>
+          <w:rFonts w:ascii="Consolas" w:hAnsi="Consolas"/>
+          <w:color w:val="1E1E1E"/>
+          <w:sz w:val="17"/>
+        </w:rPr>
+        <w:br/>
+        <w:t xml:space="preserve">     |                          |   interview guide -------|-------------------------&gt;|</w:t>
+      </w:r>
+      <w:r>
+        <w:rPr>
+          <w:rFonts w:ascii="Consolas" w:hAnsi="Consolas"/>
+          <w:color w:val="1E1E1E"/>
+          <w:sz w:val="17"/>
+        </w:rPr>
+        <w:br/>
+        <w:t xml:space="preserve">     |                          |                          |                          |</w:t>
+      </w:r>
+      <w:r>
+        <w:rPr>
+          <w:rFonts w:ascii="Consolas" w:hAnsi="Consolas"/>
+          <w:color w:val="1E1E1E"/>
+          <w:sz w:val="17"/>
+        </w:rPr>
+        <w:br/>
+        <w:t xml:space="preserve">     |                          |                          |              Interview --&gt;|</w:t>
+      </w:r>
+      <w:r>
+        <w:rPr>
+          <w:rFonts w:ascii="Consolas" w:hAnsi="Consolas"/>
+          <w:color w:val="1E1E1E"/>
+          <w:sz w:val="17"/>
+        </w:rPr>
+        <w:br/>
+        <w:t xml:space="preserve">     |                          |                          |                          |</w:t>
+      </w:r>
+      <w:r>
+        <w:rPr>
+          <w:rFonts w:ascii="Consolas" w:hAnsi="Consolas"/>
+          <w:color w:val="1E1E1E"/>
+          <w:sz w:val="17"/>
+        </w:rPr>
+        <w:br/>
+        <w:t xml:space="preserve">     |                          |                          |          Scorecard       |</w:t>
+      </w:r>
+      <w:r>
+        <w:rPr>
+          <w:rFonts w:ascii="Consolas" w:hAnsi="Consolas"/>
+          <w:color w:val="1E1E1E"/>
+          <w:sz w:val="17"/>
+        </w:rPr>
+        <w:br/>
+        <w:t xml:space="preserve">     |                          |                          |          (0/3/5 × 11) --&gt;|</w:t>
+      </w:r>
+      <w:r>
+        <w:rPr>
+          <w:rFonts w:ascii="Consolas" w:hAnsi="Consolas"/>
+          <w:color w:val="1E1E1E"/>
+          <w:sz w:val="17"/>
+        </w:rPr>
+        <w:br/>
       </w:r>
       <w:r>
         <w:rPr>
@@ -12273,276 +12536,6 @@
           <w:sz w:val="17"/>
         </w:rPr>
         <w:lastRenderedPageBreak/>
-        <w:t xml:space="preserve">     |-- Add candidates -------&gt;|                          |                          |</w:t>
-      </w:r>
-      <w:r>
-        <w:rPr>
-          <w:rFonts w:ascii="Consolas" w:hAnsi="Consolas"/>
-          <w:color w:val="1E1E1E"/>
-          <w:sz w:val="17"/>
-        </w:rPr>
-        <w:br/>
-        <w:t xml:space="preserve">     |                          |-- Send BML invitation --&gt;|                          |</w:t>
-      </w:r>
-      <w:r>
-        <w:rPr>
-          <w:rFonts w:ascii="Consolas" w:hAnsi="Consolas"/>
-          <w:color w:val="1E1E1E"/>
-          <w:sz w:val="17"/>
-        </w:rPr>
-        <w:br/>
-        <w:t xml:space="preserve">     |                          |                          |                          |</w:t>
-      </w:r>
-      <w:r>
-        <w:rPr>
-          <w:rFonts w:ascii="Consolas" w:hAnsi="Consolas"/>
-          <w:color w:val="1E1E1E"/>
-          <w:sz w:val="17"/>
-        </w:rPr>
-        <w:br/>
-        <w:t xml:space="preserve">     |                          |                          |-- Complete 48-question    |</w:t>
-      </w:r>
-      <w:r>
-        <w:rPr>
-          <w:rFonts w:ascii="Consolas" w:hAnsi="Consolas"/>
-          <w:color w:val="1E1E1E"/>
-          <w:sz w:val="17"/>
-        </w:rPr>
-        <w:br/>
-        <w:t xml:space="preserve">     |                          |                          |   Likert survey (15 min)  |</w:t>
-      </w:r>
-      <w:r>
-        <w:rPr>
-          <w:rFonts w:ascii="Consolas" w:hAnsi="Consolas"/>
-          <w:color w:val="1E1E1E"/>
-          <w:sz w:val="17"/>
-        </w:rPr>
-        <w:br/>
-        <w:t xml:space="preserve">     |                          |                          |                          |</w:t>
-      </w:r>
-      <w:r>
-        <w:rPr>
-          <w:rFonts w:ascii="Consolas" w:hAnsi="Consolas"/>
-          <w:color w:val="1E1E1E"/>
-          <w:sz w:val="17"/>
-        </w:rPr>
-        <w:br/>
-        <w:t xml:space="preserve">     |                          |&lt;-- BML responses --------|                          |</w:t>
-      </w:r>
-      <w:r>
-        <w:rPr>
-          <w:rFonts w:ascii="Consolas" w:hAnsi="Consolas"/>
-          <w:color w:val="1E1E1E"/>
-          <w:sz w:val="17"/>
-        </w:rPr>
-        <w:br/>
-        <w:t xml:space="preserve">     |                          |                          |                          |</w:t>
-      </w:r>
-      <w:r>
-        <w:rPr>
-          <w:rFonts w:ascii="Consolas" w:hAnsi="Consolas"/>
-          <w:color w:val="1E1E1E"/>
-          <w:sz w:val="17"/>
-        </w:rPr>
-        <w:br/>
-        <w:t xml:space="preserve">     |                          |-- Normalize scores       |                          |</w:t>
-      </w:r>
-      <w:r>
-        <w:rPr>
-          <w:rFonts w:ascii="Consolas" w:hAnsi="Consolas"/>
-          <w:color w:val="1E1E1E"/>
-          <w:sz w:val="17"/>
-        </w:rPr>
-        <w:br/>
-        <w:t xml:space="preserve">     |                          |   (Likert 1-7 → 0-100%) |                          |</w:t>
-      </w:r>
-      <w:r>
-        <w:rPr>
-          <w:rFonts w:ascii="Consolas" w:hAnsi="Consolas"/>
-          <w:color w:val="1E1E1E"/>
-          <w:sz w:val="17"/>
-        </w:rPr>
-        <w:br/>
-        <w:t xml:space="preserve">     |                          |                          |                          |</w:t>
-      </w:r>
-      <w:r>
-        <w:rPr>
-          <w:rFonts w:ascii="Consolas" w:hAnsi="Consolas"/>
-          <w:color w:val="1E1E1E"/>
-          <w:sz w:val="17"/>
-        </w:rPr>
-        <w:br/>
-        <w:t xml:space="preserve">     |                          |-- Calculate variation    |                          |</w:t>
-      </w:r>
-      <w:r>
-        <w:rPr>
-          <w:rFonts w:ascii="Consolas" w:hAnsi="Consolas"/>
-          <w:color w:val="1E1E1E"/>
-          <w:sz w:val="17"/>
-        </w:rPr>
-        <w:br/>
-        <w:t xml:space="preserve">     |                          |   per dimension          |                          |</w:t>
-      </w:r>
-      <w:r>
-        <w:rPr>
-          <w:rFonts w:ascii="Consolas" w:hAnsi="Consolas"/>
-          <w:color w:val="1E1E1E"/>
-          <w:sz w:val="17"/>
-        </w:rPr>
-        <w:br/>
-        <w:t xml:space="preserve">     |                          |                          |                          |</w:t>
-      </w:r>
-      <w:r>
-        <w:rPr>
-          <w:rFonts w:ascii="Consolas" w:hAnsi="Consolas"/>
-          <w:color w:val="1E1E1E"/>
-          <w:sz w:val="17"/>
-        </w:rPr>
-        <w:br/>
-        <w:t xml:space="preserve">     |                          |-- Classify tier          |                          |</w:t>
-      </w:r>
-      <w:r>
-        <w:rPr>
-          <w:rFonts w:ascii="Consolas" w:hAnsi="Consolas"/>
-          <w:color w:val="1E1E1E"/>
-          <w:sz w:val="17"/>
-        </w:rPr>
-        <w:br/>
-        <w:t xml:space="preserve">     |                          |   (Strong/Potential/     |                          |</w:t>
-      </w:r>
-      <w:r>
-        <w:rPr>
-          <w:rFonts w:ascii="Consolas" w:hAnsi="Consolas"/>
-          <w:color w:val="1E1E1E"/>
-          <w:sz w:val="17"/>
-        </w:rPr>
-        <w:br/>
-        <w:t xml:space="preserve">     |                          |    Misalignment)         |                          |</w:t>
-      </w:r>
-      <w:r>
-        <w:rPr>
-          <w:rFonts w:ascii="Consolas" w:hAnsi="Consolas"/>
-          <w:color w:val="1E1E1E"/>
-          <w:sz w:val="17"/>
-        </w:rPr>
-        <w:br/>
-        <w:t xml:space="preserve">     |                          |                          |                          |</w:t>
-      </w:r>
-      <w:r>
-        <w:rPr>
-          <w:rFonts w:ascii="Consolas" w:hAnsi="Consolas"/>
-          <w:color w:val="1E1E1E"/>
-          <w:sz w:val="17"/>
-        </w:rPr>
-        <w:br/>
-        <w:t xml:space="preserve">     |                          |-- Rank all candidates    |                          |</w:t>
-      </w:r>
-      <w:r>
-        <w:rPr>
-          <w:rFonts w:ascii="Consolas" w:hAnsi="Consolas"/>
-          <w:color w:val="1E1E1E"/>
-          <w:sz w:val="17"/>
-        </w:rPr>
-        <w:br/>
-        <w:t xml:space="preserve">     |                          |   by total variation     |                          |</w:t>
-      </w:r>
-      <w:r>
-        <w:rPr>
-          <w:rFonts w:ascii="Consolas" w:hAnsi="Consolas"/>
-          <w:color w:val="1E1E1E"/>
-          <w:sz w:val="17"/>
-        </w:rPr>
-        <w:br/>
-        <w:t xml:space="preserve">     |                          |                          |                          |</w:t>
-      </w:r>
-      <w:r>
-        <w:rPr>
-          <w:rFonts w:ascii="Consolas" w:hAnsi="Consolas"/>
-          <w:color w:val="1E1E1E"/>
-          <w:sz w:val="17"/>
-        </w:rPr>
-        <w:br/>
-        <w:t xml:space="preserve">     |&lt;-- Ranked shortlist -----|                          |                          |</w:t>
-      </w:r>
-      <w:r>
-        <w:rPr>
-          <w:rFonts w:ascii="Consolas" w:hAnsi="Consolas"/>
-          <w:color w:val="1E1E1E"/>
-          <w:sz w:val="17"/>
-        </w:rPr>
-        <w:br/>
-        <w:t xml:space="preserve">     |                          |                          |                          |</w:t>
-      </w:r>
-      <w:r>
-        <w:rPr>
-          <w:rFonts w:ascii="Consolas" w:hAnsi="Consolas"/>
-          <w:color w:val="1E1E1E"/>
-          <w:sz w:val="17"/>
-        </w:rPr>
-        <w:br/>
-        <w:t xml:space="preserve">     |                          |-- James generates        |                          |</w:t>
-      </w:r>
-      <w:r>
-        <w:rPr>
-          <w:rFonts w:ascii="Consolas" w:hAnsi="Consolas"/>
-          <w:color w:val="1E1E1E"/>
-          <w:sz w:val="17"/>
-        </w:rPr>
-        <w:br/>
-        <w:t xml:space="preserve">     |                          |   interview guide -------|-------------------------&gt;|</w:t>
-      </w:r>
-      <w:r>
-        <w:rPr>
-          <w:rFonts w:ascii="Consolas" w:hAnsi="Consolas"/>
-          <w:color w:val="1E1E1E"/>
-          <w:sz w:val="17"/>
-        </w:rPr>
-        <w:br/>
-        <w:t xml:space="preserve">     |                          |                          |                          |</w:t>
-      </w:r>
-      <w:r>
-        <w:rPr>
-          <w:rFonts w:ascii="Consolas" w:hAnsi="Consolas"/>
-          <w:color w:val="1E1E1E"/>
-          <w:sz w:val="17"/>
-        </w:rPr>
-        <w:br/>
-        <w:t xml:space="preserve">     |                          |                          |              Interview --&gt;|</w:t>
-      </w:r>
-      <w:r>
-        <w:rPr>
-          <w:rFonts w:ascii="Consolas" w:hAnsi="Consolas"/>
-          <w:color w:val="1E1E1E"/>
-          <w:sz w:val="17"/>
-        </w:rPr>
-        <w:br/>
-        <w:t xml:space="preserve">     |                          |                          |                          |</w:t>
-      </w:r>
-      <w:r>
-        <w:rPr>
-          <w:rFonts w:ascii="Consolas" w:hAnsi="Consolas"/>
-          <w:color w:val="1E1E1E"/>
-          <w:sz w:val="17"/>
-        </w:rPr>
-        <w:br/>
-        <w:t xml:space="preserve">     |                          |                          |          Scorecard       |</w:t>
-      </w:r>
-      <w:r>
-        <w:rPr>
-          <w:rFonts w:ascii="Consolas" w:hAnsi="Consolas"/>
-          <w:color w:val="1E1E1E"/>
-          <w:sz w:val="17"/>
-        </w:rPr>
-        <w:br/>
-        <w:t xml:space="preserve">     |                          |                          |          (0/3/5 × 11) --&gt;|</w:t>
-      </w:r>
-      <w:r>
-        <w:rPr>
-          <w:rFonts w:ascii="Consolas" w:hAnsi="Consolas"/>
-          <w:color w:val="1E1E1E"/>
-          <w:sz w:val="17"/>
-        </w:rPr>
-        <w:br/>
         <w:t xml:space="preserve">     |                          |                          |                          |</w:t>
       </w:r>
       <w:r>
@@ -12912,14 +12905,7 @@
               <w:rPr>
                 <w:sz w:val="20"/>
               </w:rPr>
-              <w:t xml:space="preserve">SiteID, ClientID, </w:t>
-            </w:r>
-            <w:r>
-              <w:rPr>
-                <w:sz w:val="20"/>
-              </w:rPr>
-              <w:lastRenderedPageBreak/>
-              <w:t>ExternalIdent, EntityTypeID</w:t>
+              <w:t>SiteID, ClientID, ExternalIdent, EntityTypeID</w:t>
             </w:r>
           </w:p>
         </w:tc>
@@ -12935,7 +12921,6 @@
               <w:rPr>
                 <w:sz w:val="20"/>
               </w:rPr>
-              <w:lastRenderedPageBreak/>
               <w:t>ObjectExists, ActionURL1</w:t>
             </w:r>
           </w:p>

</xml_diff>